<commit_message>
Fix education row layout in resume
Co-Authored-By: Claude Sonnet 5.5 <noreply@anthropic.com>
Claude-Session: https://claude.ai/code/session_01PBFWoynjvffX3KwhYepgBb
</commit_message>
<xml_diff>
--- a/resume/Tamil_Mani_B_Resume.docx
+++ b/resume/Tamil_Mani_B_Resume.docx
@@ -72,7 +72,7 @@
         </w:rPr>
         <w:t xml:space="preserve">  |  </w:t>
       </w:r>
-      <w:hyperlink w:history="1" r:id="rId4eejb6ilmhhqwyzsizql4">
+      <w:hyperlink w:history="1" r:id="rIdpxdq2fmnvmnyrxab4dwor">
         <w:r>
           <w:rPr>
             <w:rFonts w:ascii="Calibri" w:cs="Calibri" w:eastAsia="Calibri" w:hAnsi="Calibri"/>
@@ -93,7 +93,7 @@
         </w:rPr>
         <w:t xml:space="preserve">  |  </w:t>
       </w:r>
-      <w:hyperlink w:history="1" r:id="rIdleqcvyeavtysvaghq4m6g">
+      <w:hyperlink w:history="1" r:id="rId83zwci2r23prqrdnvr0ev">
         <w:r>
           <w:rPr>
             <w:rFonts w:ascii="Calibri" w:cs="Calibri" w:eastAsia="Calibri" w:hAnsi="Calibri"/>
@@ -114,7 +114,7 @@
         </w:rPr>
         <w:t xml:space="preserve">  |  </w:t>
       </w:r>
-      <w:hyperlink w:history="1" r:id="rIdhb6tagwcdrrfrrutab2uf">
+      <w:hyperlink w:history="1" r:id="rIdnqiryulxya6t_cpvrvsww">
         <w:r>
           <w:rPr>
             <w:rFonts w:ascii="Calibri" w:cs="Calibri" w:eastAsia="Calibri" w:hAnsi="Calibri"/>
@@ -135,7 +135,7 @@
         </w:rPr>
         <w:t xml:space="preserve">  |  </w:t>
       </w:r>
-      <w:hyperlink w:history="1" r:id="rIdviyybk9plpvnwwz403bot">
+      <w:hyperlink w:history="1" r:id="rIdmuffwhrz8wicrz-xew8dj">
         <w:r>
           <w:rPr>
             <w:rFonts w:ascii="Calibri" w:cs="Calibri" w:eastAsia="Calibri" w:hAnsi="Calibri"/>
@@ -247,7 +247,7 @@
           <w:sz w:val="20"/>
           <w:szCs w:val="20"/>
         </w:rPr>
-        <w:t xml:space="preserve">Microsoft Azure (AZ-900), Azure Resource Manager APIs, Entra ID / RBAC, Docker, CI/CD, REST APIs, Microservices</w:t>
+        <w:t xml:space="preserve">Microsoft Azure (AZ-900), Azure Resource Manager APIs, Entra ID / RBAC, Docker, CI/CD, REST APIs</w:t>
       </w:r>
     </w:p>
     <w:p>
@@ -991,7 +991,7 @@
           <w:sz w:val="20"/>
           <w:szCs w:val="20"/>
         </w:rPr>
-        <w:t xml:space="preserve">, Chennai  —  B.E. Computer Science and Engineering (CGPA 7.68/10)</w:t>
+        <w:t xml:space="preserve">, Chennai</w:t>
       </w:r>
       <w:r>
         <w:rPr>
@@ -1004,10 +1004,25 @@
       <w:r>
         <w:rPr>
           <w:rFonts w:ascii="Calibri" w:cs="Calibri" w:eastAsia="Calibri" w:hAnsi="Calibri"/>
+          <w:color w:val="595959"/>
           <w:sz w:val="20"/>
           <w:szCs w:val="20"/>
         </w:rPr>
         <w:t xml:space="preserve">Expected May 2028</w:t>
+      </w:r>
+    </w:p>
+    <w:p>
+      <w:pPr>
+        <w:spacing w:after="15" w:before="0" w:line="245"/>
+        <w:jc w:val="left"/>
+      </w:pPr>
+      <w:r>
+        <w:rPr>
+          <w:rFonts w:ascii="Calibri" w:cs="Calibri" w:eastAsia="Calibri" w:hAnsi="Calibri"/>
+          <w:sz w:val="20"/>
+          <w:szCs w:val="20"/>
+        </w:rPr>
+        <w:t xml:space="preserve">B.E. Computer Science and Engineering  |  CGPA: 7.68 / 10</w:t>
       </w:r>
     </w:p>
     <w:p>

</xml_diff>

<commit_message>
Resume: all-black text, remove italics
Co-Authored-By: Claude Sonnet 5.5 <noreply@anthropic.com>
Claude-Session: https://claude.ai/code/session_01PBFWoynjvffX3KwhYepgBb
</commit_message>
<xml_diff>
--- a/resume/Tamil_Mani_B_Resume.docx
+++ b/resume/Tamil_Mani_B_Resume.docx
@@ -12,7 +12,7 @@
           <w:rFonts w:ascii="Calibri" w:cs="Calibri" w:eastAsia="Calibri" w:hAnsi="Calibri"/>
           <w:b/>
           <w:bCs/>
-          <w:color w:val="1F3864"/>
+          <w:color w:val="000000"/>
           <w:sz w:val="40"/>
           <w:szCs w:val="40"/>
         </w:rPr>
@@ -26,7 +26,7 @@
       <w:r>
         <w:rPr>
           <w:rFonts w:ascii="Calibri" w:cs="Calibri" w:eastAsia="Calibri" w:hAnsi="Calibri"/>
-          <w:color w:val="595959"/>
+          <w:color w:val="000000"/>
           <w:sz w:val="21"/>
           <w:szCs w:val="21"/>
         </w:rPr>
@@ -49,7 +49,7 @@
       <w:r>
         <w:rPr>
           <w:rFonts w:ascii="Calibri" w:cs="Calibri" w:eastAsia="Calibri" w:hAnsi="Calibri"/>
-          <w:color w:val="595959"/>
+          <w:color w:val="000000"/>
           <w:sz w:val="19"/>
           <w:szCs w:val="19"/>
         </w:rPr>
@@ -66,17 +66,17 @@
       <w:r>
         <w:rPr>
           <w:rFonts w:ascii="Calibri" w:cs="Calibri" w:eastAsia="Calibri" w:hAnsi="Calibri"/>
-          <w:color w:val="595959"/>
+          <w:color w:val="000000"/>
           <w:sz w:val="19"/>
           <w:szCs w:val="19"/>
         </w:rPr>
         <w:t xml:space="preserve">  |  </w:t>
       </w:r>
-      <w:hyperlink w:history="1" r:id="rIdpxdq2fmnvmnyrxab4dwor">
+      <w:hyperlink w:history="1" r:id="rIdeodub36qvjyt0xlojqfnb">
         <w:r>
           <w:rPr>
             <w:rFonts w:ascii="Calibri" w:cs="Calibri" w:eastAsia="Calibri" w:hAnsi="Calibri"/>
-            <w:color w:val="1F3864"/>
+            <w:color w:val="000000"/>
             <w:sz w:val="19"/>
             <w:szCs w:val="19"/>
             <w:u w:val="single"/>
@@ -87,17 +87,17 @@
       <w:r>
         <w:rPr>
           <w:rFonts w:ascii="Calibri" w:cs="Calibri" w:eastAsia="Calibri" w:hAnsi="Calibri"/>
-          <w:color w:val="595959"/>
+          <w:color w:val="000000"/>
           <w:sz w:val="19"/>
           <w:szCs w:val="19"/>
         </w:rPr>
         <w:t xml:space="preserve">  |  </w:t>
       </w:r>
-      <w:hyperlink w:history="1" r:id="rId83zwci2r23prqrdnvr0ev">
+      <w:hyperlink w:history="1" r:id="rIdtilxi_is_tif6uxscxylh">
         <w:r>
           <w:rPr>
             <w:rFonts w:ascii="Calibri" w:cs="Calibri" w:eastAsia="Calibri" w:hAnsi="Calibri"/>
-            <w:color w:val="1F3864"/>
+            <w:color w:val="000000"/>
             <w:sz w:val="19"/>
             <w:szCs w:val="19"/>
             <w:u w:val="single"/>
@@ -108,17 +108,17 @@
       <w:r>
         <w:rPr>
           <w:rFonts w:ascii="Calibri" w:cs="Calibri" w:eastAsia="Calibri" w:hAnsi="Calibri"/>
-          <w:color w:val="595959"/>
+          <w:color w:val="000000"/>
           <w:sz w:val="19"/>
           <w:szCs w:val="19"/>
         </w:rPr>
         <w:t xml:space="preserve">  |  </w:t>
       </w:r>
-      <w:hyperlink w:history="1" r:id="rIdnqiryulxya6t_cpvrvsww">
+      <w:hyperlink w:history="1" r:id="rId4ig1clo4-lzllcprqqskh">
         <w:r>
           <w:rPr>
             <w:rFonts w:ascii="Calibri" w:cs="Calibri" w:eastAsia="Calibri" w:hAnsi="Calibri"/>
-            <w:color w:val="1F3864"/>
+            <w:color w:val="000000"/>
             <w:sz w:val="19"/>
             <w:szCs w:val="19"/>
             <w:u w:val="single"/>
@@ -129,17 +129,17 @@
       <w:r>
         <w:rPr>
           <w:rFonts w:ascii="Calibri" w:cs="Calibri" w:eastAsia="Calibri" w:hAnsi="Calibri"/>
-          <w:color w:val="595959"/>
+          <w:color w:val="000000"/>
           <w:sz w:val="19"/>
           <w:szCs w:val="19"/>
         </w:rPr>
         <w:t xml:space="preserve">  |  </w:t>
       </w:r>
-      <w:hyperlink w:history="1" r:id="rIdmuffwhrz8wicrz-xew8dj">
+      <w:hyperlink w:history="1" r:id="rIdnddwgmrh92ribkuhpik22">
         <w:r>
           <w:rPr>
             <w:rFonts w:ascii="Calibri" w:cs="Calibri" w:eastAsia="Calibri" w:hAnsi="Calibri"/>
-            <w:color w:val="1F3864"/>
+            <w:color w:val="000000"/>
             <w:sz w:val="19"/>
             <w:szCs w:val="19"/>
             <w:u w:val="single"/>
@@ -152,7 +152,7 @@
       <w:pPr>
         <w:keepNext/>
         <w:pBdr>
-          <w:bottom w:val="single" w:color="1F3864" w:sz="6" w:space="1"/>
+          <w:bottom w:val="single" w:color="000000" w:sz="6" w:space="1"/>
         </w:pBdr>
         <w:spacing w:after="40" w:before="100"/>
       </w:pPr>
@@ -161,7 +161,7 @@
           <w:rFonts w:ascii="Calibri" w:cs="Calibri" w:eastAsia="Calibri" w:hAnsi="Calibri"/>
           <w:b/>
           <w:bCs/>
-          <w:color w:val="1F3864"/>
+          <w:color w:val="000000"/>
           <w:sz w:val="22"/>
           <w:szCs w:val="22"/>
         </w:rPr>
@@ -186,7 +186,7 @@
       <w:pPr>
         <w:keepNext/>
         <w:pBdr>
-          <w:bottom w:val="single" w:color="1F3864" w:sz="6" w:space="1"/>
+          <w:bottom w:val="single" w:color="000000" w:sz="6" w:space="1"/>
         </w:pBdr>
         <w:spacing w:after="40" w:before="100"/>
       </w:pPr>
@@ -195,7 +195,7 @@
           <w:rFonts w:ascii="Calibri" w:cs="Calibri" w:eastAsia="Calibri" w:hAnsi="Calibri"/>
           <w:b/>
           <w:bCs/>
-          <w:color w:val="1F3864"/>
+          <w:color w:val="000000"/>
           <w:sz w:val="22"/>
           <w:szCs w:val="22"/>
         </w:rPr>
@@ -326,7 +326,7 @@
       <w:pPr>
         <w:keepNext/>
         <w:pBdr>
-          <w:bottom w:val="single" w:color="1F3864" w:sz="6" w:space="1"/>
+          <w:bottom w:val="single" w:color="000000" w:sz="6" w:space="1"/>
         </w:pBdr>
         <w:spacing w:after="40" w:before="100"/>
       </w:pPr>
@@ -335,7 +335,7 @@
           <w:rFonts w:ascii="Calibri" w:cs="Calibri" w:eastAsia="Calibri" w:hAnsi="Calibri"/>
           <w:b/>
           <w:bCs/>
-          <w:color w:val="1F3864"/>
+          <w:color w:val="000000"/>
           <w:sz w:val="22"/>
           <w:szCs w:val="22"/>
         </w:rPr>
@@ -380,9 +380,7 @@
       <w:r>
         <w:rPr>
           <w:rFonts w:ascii="Calibri" w:cs="Calibri" w:eastAsia="Calibri" w:hAnsi="Calibri"/>
-          <w:i/>
-          <w:iCs/>
-          <w:color w:val="595959"/>
+          <w:color w:val="000000"/>
           <w:sz w:val="20"/>
           <w:szCs w:val="20"/>
         </w:rPr>
@@ -467,7 +465,7 @@
           <w:rFonts w:ascii="Calibri" w:cs="Calibri" w:eastAsia="Calibri" w:hAnsi="Calibri"/>
           <w:b/>
           <w:bCs/>
-          <w:color w:val="1F3864"/>
+          <w:color w:val="000000"/>
           <w:sz w:val="20"/>
           <w:szCs w:val="20"/>
         </w:rPr>
@@ -552,7 +550,7 @@
           <w:rFonts w:ascii="Calibri" w:cs="Calibri" w:eastAsia="Calibri" w:hAnsi="Calibri"/>
           <w:b/>
           <w:bCs/>
-          <w:color w:val="1F3864"/>
+          <w:color w:val="000000"/>
           <w:sz w:val="20"/>
           <w:szCs w:val="20"/>
         </w:rPr>
@@ -637,7 +635,7 @@
           <w:rFonts w:ascii="Calibri" w:cs="Calibri" w:eastAsia="Calibri" w:hAnsi="Calibri"/>
           <w:b/>
           <w:bCs/>
-          <w:color w:val="1F3864"/>
+          <w:color w:val="000000"/>
           <w:sz w:val="20"/>
           <w:szCs w:val="20"/>
         </w:rPr>
@@ -701,9 +699,7 @@
       <w:r>
         <w:rPr>
           <w:rFonts w:ascii="Calibri" w:cs="Calibri" w:eastAsia="Calibri" w:hAnsi="Calibri"/>
-          <w:i/>
-          <w:iCs/>
-          <w:color w:val="595959"/>
+          <w:color w:val="000000"/>
           <w:sz w:val="20"/>
           <w:szCs w:val="20"/>
         </w:rPr>
@@ -733,7 +729,7 @@
       <w:pPr>
         <w:keepNext/>
         <w:pBdr>
-          <w:bottom w:val="single" w:color="1F3864" w:sz="6" w:space="1"/>
+          <w:bottom w:val="single" w:color="000000" w:sz="6" w:space="1"/>
         </w:pBdr>
         <w:spacing w:after="40" w:before="100"/>
       </w:pPr>
@@ -742,7 +738,7 @@
           <w:rFonts w:ascii="Calibri" w:cs="Calibri" w:eastAsia="Calibri" w:hAnsi="Calibri"/>
           <w:b/>
           <w:bCs/>
-          <w:color w:val="1F3864"/>
+          <w:color w:val="000000"/>
           <w:sz w:val="22"/>
           <w:szCs w:val="22"/>
         </w:rPr>
@@ -787,7 +783,7 @@
       <w:r>
         <w:rPr>
           <w:rFonts w:ascii="Calibri" w:cs="Calibri" w:eastAsia="Calibri" w:hAnsi="Calibri"/>
-          <w:color w:val="595959"/>
+          <w:color w:val="000000"/>
           <w:sz w:val="20"/>
           <w:szCs w:val="20"/>
         </w:rPr>
@@ -836,7 +832,7 @@
       <w:pPr>
         <w:keepNext/>
         <w:pBdr>
-          <w:bottom w:val="single" w:color="1F3864" w:sz="6" w:space="1"/>
+          <w:bottom w:val="single" w:color="000000" w:sz="6" w:space="1"/>
         </w:pBdr>
         <w:spacing w:after="40" w:before="100"/>
       </w:pPr>
@@ -845,7 +841,7 @@
           <w:rFonts w:ascii="Calibri" w:cs="Calibri" w:eastAsia="Calibri" w:hAnsi="Calibri"/>
           <w:b/>
           <w:bCs/>
-          <w:color w:val="1F3864"/>
+          <w:color w:val="000000"/>
           <w:sz w:val="22"/>
           <w:szCs w:val="22"/>
         </w:rPr>
@@ -950,7 +946,7 @@
       <w:pPr>
         <w:keepNext/>
         <w:pBdr>
-          <w:bottom w:val="single" w:color="1F3864" w:sz="6" w:space="1"/>
+          <w:bottom w:val="single" w:color="000000" w:sz="6" w:space="1"/>
         </w:pBdr>
         <w:spacing w:after="40" w:before="100"/>
       </w:pPr>
@@ -959,7 +955,7 @@
           <w:rFonts w:ascii="Calibri" w:cs="Calibri" w:eastAsia="Calibri" w:hAnsi="Calibri"/>
           <w:b/>
           <w:bCs/>
-          <w:color w:val="1F3864"/>
+          <w:color w:val="000000"/>
           <w:sz w:val="22"/>
           <w:szCs w:val="22"/>
         </w:rPr>
@@ -1004,7 +1000,7 @@
       <w:r>
         <w:rPr>
           <w:rFonts w:ascii="Calibri" w:cs="Calibri" w:eastAsia="Calibri" w:hAnsi="Calibri"/>
-          <w:color w:val="595959"/>
+          <w:color w:val="000000"/>
           <w:sz w:val="20"/>
           <w:szCs w:val="20"/>
         </w:rPr>

</xml_diff>

<commit_message>
Resume: education first, standard section order, drop summary
Co-Authored-By: Claude Sonnet 5.5 <noreply@anthropic.com>
Claude-Session: https://claude.ai/code/session_01PBFWoynjvffX3KwhYepgBb
</commit_message>
<xml_diff>
--- a/resume/Tamil_Mani_B_Resume.docx
+++ b/resume/Tamil_Mani_B_Resume.docx
@@ -72,7 +72,7 @@
         </w:rPr>
         <w:t xml:space="preserve">  |  </w:t>
       </w:r>
-      <w:hyperlink w:history="1" r:id="rIdeodub36qvjyt0xlojqfnb">
+      <w:hyperlink w:history="1" r:id="rIduo-5r8arf8sd0xvfhnqmv">
         <w:r>
           <w:rPr>
             <w:rFonts w:ascii="Calibri" w:cs="Calibri" w:eastAsia="Calibri" w:hAnsi="Calibri"/>
@@ -93,7 +93,7 @@
         </w:rPr>
         <w:t xml:space="preserve">  |  </w:t>
       </w:r>
-      <w:hyperlink w:history="1" r:id="rIdtilxi_is_tif6uxscxylh">
+      <w:hyperlink w:history="1" r:id="rId4rbkebogyxn8o_nbeskdw">
         <w:r>
           <w:rPr>
             <w:rFonts w:ascii="Calibri" w:cs="Calibri" w:eastAsia="Calibri" w:hAnsi="Calibri"/>
@@ -114,7 +114,7 @@
         </w:rPr>
         <w:t xml:space="preserve">  |  </w:t>
       </w:r>
-      <w:hyperlink w:history="1" r:id="rId4ig1clo4-lzllcprqqskh">
+      <w:hyperlink w:history="1" r:id="rIdd3aji65rixch3-p0ppbhl">
         <w:r>
           <w:rPr>
             <w:rFonts w:ascii="Calibri" w:cs="Calibri" w:eastAsia="Calibri" w:hAnsi="Calibri"/>
@@ -135,7 +135,7 @@
         </w:rPr>
         <w:t xml:space="preserve">  |  </w:t>
       </w:r>
-      <w:hyperlink w:history="1" r:id="rIdnddwgmrh92ribkuhpik22">
+      <w:hyperlink w:history="1" r:id="rIdytbzrgujzglypdlfaodwy">
         <w:r>
           <w:rPr>
             <w:rFonts w:ascii="Calibri" w:cs="Calibri" w:eastAsia="Calibri" w:hAnsi="Calibri"/>
@@ -154,7 +154,7 @@
         <w:pBdr>
           <w:bottom w:val="single" w:color="000000" w:sz="6" w:space="1"/>
         </w:pBdr>
-        <w:spacing w:after="40" w:before="100"/>
+        <w:spacing w:after="50" w:before="140"/>
       </w:pPr>
       <w:r>
         <w:rPr>
@@ -165,181 +165,7 @@
           <w:sz w:val="22"/>
           <w:szCs w:val="22"/>
         </w:rPr>
-        <w:t xml:space="preserve">SUMMARY</w:t>
-      </w:r>
-    </w:p>
-    <w:p>
-      <w:pPr>
-        <w:spacing w:after="0" w:before="0" w:line="250"/>
-        <w:jc w:val="both"/>
-      </w:pPr>
-      <w:r>
-        <w:rPr>
-          <w:rFonts w:ascii="Calibri" w:cs="Calibri" w:eastAsia="Calibri" w:hAnsi="Calibri"/>
-          <w:sz w:val="20"/>
-          <w:szCs w:val="20"/>
-        </w:rPr>
-        <w:t xml:space="preserve">Third-year B.E. Computer Science student who builds working systems end to end: explainable fraud analytics, offline-first public-health software, edge-AI hardware and a read-only Azure cost platform. Microsoft Azure AZ-900 certified; 4th Runner-up at Aithon 2.0; organised a college-wide debugging contest. Seeking software engineering and cloud roles.</w:t>
-      </w:r>
-    </w:p>
-    <w:p>
-      <w:pPr>
-        <w:keepNext/>
-        <w:pBdr>
-          <w:bottom w:val="single" w:color="000000" w:sz="6" w:space="1"/>
-        </w:pBdr>
-        <w:spacing w:after="40" w:before="100"/>
-      </w:pPr>
-      <w:r>
-        <w:rPr>
-          <w:rFonts w:ascii="Calibri" w:cs="Calibri" w:eastAsia="Calibri" w:hAnsi="Calibri"/>
-          <w:b/>
-          <w:bCs/>
-          <w:color w:val="000000"/>
-          <w:sz w:val="22"/>
-          <w:szCs w:val="22"/>
-        </w:rPr>
-        <w:t xml:space="preserve">TECHNICAL SKILLS</w:t>
-      </w:r>
-    </w:p>
-    <w:p>
-      <w:pPr>
-        <w:spacing w:after="15" w:before="0" w:line="245"/>
-        <w:jc w:val="left"/>
-      </w:pPr>
-      <w:r>
-        <w:rPr>
-          <w:rFonts w:ascii="Calibri" w:cs="Calibri" w:eastAsia="Calibri" w:hAnsi="Calibri"/>
-          <w:b/>
-          <w:bCs/>
-          <w:sz w:val="20"/>
-          <w:szCs w:val="20"/>
-        </w:rPr>
-        <w:t xml:space="preserve">Languages: </w:t>
-      </w:r>
-      <w:r>
-        <w:rPr>
-          <w:rFonts w:ascii="Calibri" w:cs="Calibri" w:eastAsia="Calibri" w:hAnsi="Calibri"/>
-          <w:sz w:val="20"/>
-          <w:szCs w:val="20"/>
-        </w:rPr>
-        <w:t xml:space="preserve">Java, C++, Python, JavaScript (ES6+), TypeScript, SQL, Embedded C/C++</w:t>
-      </w:r>
-    </w:p>
-    <w:p>
-      <w:pPr>
-        <w:spacing w:after="15" w:before="0" w:line="245"/>
-        <w:jc w:val="left"/>
-      </w:pPr>
-      <w:r>
-        <w:rPr>
-          <w:rFonts w:ascii="Calibri" w:cs="Calibri" w:eastAsia="Calibri" w:hAnsi="Calibri"/>
-          <w:b/>
-          <w:bCs/>
-          <w:sz w:val="20"/>
-          <w:szCs w:val="20"/>
-        </w:rPr>
-        <w:t xml:space="preserve">Cloud &amp; DevOps: </w:t>
-      </w:r>
-      <w:r>
-        <w:rPr>
-          <w:rFonts w:ascii="Calibri" w:cs="Calibri" w:eastAsia="Calibri" w:hAnsi="Calibri"/>
-          <w:sz w:val="20"/>
-          <w:szCs w:val="20"/>
-        </w:rPr>
-        <w:t xml:space="preserve">Microsoft Azure (AZ-900), Azure Resource Manager APIs, Entra ID / RBAC, Docker, CI/CD, REST APIs</w:t>
-      </w:r>
-    </w:p>
-    <w:p>
-      <w:pPr>
-        <w:spacing w:after="15" w:before="0" w:line="245"/>
-        <w:jc w:val="left"/>
-      </w:pPr>
-      <w:r>
-        <w:rPr>
-          <w:rFonts w:ascii="Calibri" w:cs="Calibri" w:eastAsia="Calibri" w:hAnsi="Calibri"/>
-          <w:b/>
-          <w:bCs/>
-          <w:sz w:val="20"/>
-          <w:szCs w:val="20"/>
-        </w:rPr>
-        <w:t xml:space="preserve">Web &amp; Backend: </w:t>
-      </w:r>
-      <w:r>
-        <w:rPr>
-          <w:rFonts w:ascii="Calibri" w:cs="Calibri" w:eastAsia="Calibri" w:hAnsi="Calibri"/>
-          <w:sz w:val="20"/>
-          <w:szCs w:val="20"/>
-        </w:rPr>
-        <w:t xml:space="preserve">Next.js 14, React 18, Node.js, Express, Flask, FastAPI, SQLAlchemy, Tailwind CSS, Supabase</w:t>
-      </w:r>
-    </w:p>
-    <w:p>
-      <w:pPr>
-        <w:spacing w:after="15" w:before="0" w:line="245"/>
-        <w:jc w:val="left"/>
-      </w:pPr>
-      <w:r>
-        <w:rPr>
-          <w:rFonts w:ascii="Calibri" w:cs="Calibri" w:eastAsia="Calibri" w:hAnsi="Calibri"/>
-          <w:b/>
-          <w:bCs/>
-          <w:sz w:val="20"/>
-          <w:szCs w:val="20"/>
-        </w:rPr>
-        <w:t xml:space="preserve">AI &amp; Data: </w:t>
-      </w:r>
-      <w:r>
-        <w:rPr>
-          <w:rFonts w:ascii="Calibri" w:cs="Calibri" w:eastAsia="Calibri" w:hAnsi="Calibri"/>
-          <w:sz w:val="20"/>
-          <w:szCs w:val="20"/>
-        </w:rPr>
-        <w:t xml:space="preserve">TensorFlow.js, TensorFlow Lite, scikit-learn, LightGBM, SHAP, NetworkX, Groq (Llama-3.1)</w:t>
-      </w:r>
-    </w:p>
-    <w:p>
-      <w:pPr>
-        <w:spacing w:after="15" w:before="0" w:line="245"/>
-        <w:jc w:val="left"/>
-      </w:pPr>
-      <w:r>
-        <w:rPr>
-          <w:rFonts w:ascii="Calibri" w:cs="Calibri" w:eastAsia="Calibri" w:hAnsi="Calibri"/>
-          <w:b/>
-          <w:bCs/>
-          <w:sz w:val="20"/>
-          <w:szCs w:val="20"/>
-        </w:rPr>
-        <w:t xml:space="preserve">Systems &amp; Tools: </w:t>
-      </w:r>
-      <w:r>
-        <w:rPr>
-          <w:rFonts w:ascii="Calibri" w:cs="Calibri" w:eastAsia="Calibri" w:hAnsi="Calibri"/>
-          <w:sz w:val="20"/>
-          <w:szCs w:val="20"/>
-        </w:rPr>
-        <w:t xml:space="preserve">WebSockets, MQTT, ESP32, Arduino, IndexedDB, Twilio Voice, Git, GitHub, Postman, Linux CLI</w:t>
-      </w:r>
-    </w:p>
-    <w:p>
-      <w:pPr>
-        <w:keepNext/>
-        <w:pBdr>
-          <w:bottom w:val="single" w:color="000000" w:sz="6" w:space="1"/>
-        </w:pBdr>
-        <w:spacing w:after="40" w:before="100"/>
-      </w:pPr>
-      <w:r>
-        <w:rPr>
-          <w:rFonts w:ascii="Calibri" w:cs="Calibri" w:eastAsia="Calibri" w:hAnsi="Calibri"/>
-          <w:b/>
-          <w:bCs/>
-          <w:color w:val="000000"/>
-          <w:sz w:val="22"/>
-          <w:szCs w:val="22"/>
-        </w:rPr>
-        <w:t xml:space="preserve">SELECTED ENGINEERING PROJECTS</w:t>
+        <w:t xml:space="preserve">EDUCATION</w:t>
       </w:r>
     </w:p>
     <w:p>
@@ -359,6 +185,272 @@
           <w:sz w:val="20"/>
           <w:szCs w:val="20"/>
         </w:rPr>
+        <w:t xml:space="preserve">R.M.K. College of Engineering and Technology</w:t>
+      </w:r>
+      <w:r>
+        <w:rPr>
+          <w:rFonts w:ascii="Calibri" w:cs="Calibri" w:eastAsia="Calibri" w:hAnsi="Calibri"/>
+          <w:sz w:val="20"/>
+          <w:szCs w:val="20"/>
+        </w:rPr>
+        <w:t xml:space="preserve">, Chennai</w:t>
+      </w:r>
+      <w:r>
+        <w:rPr>
+          <w:rFonts w:ascii="Calibri" w:cs="Calibri" w:eastAsia="Calibri" w:hAnsi="Calibri"/>
+          <w:sz w:val="20"/>
+          <w:szCs w:val="20"/>
+        </w:rPr>
+        <w:t xml:space="preserve">	</w:t>
+      </w:r>
+      <w:r>
+        <w:rPr>
+          <w:rFonts w:ascii="Calibri" w:cs="Calibri" w:eastAsia="Calibri" w:hAnsi="Calibri"/>
+          <w:sz w:val="20"/>
+          <w:szCs w:val="20"/>
+        </w:rPr>
+        <w:t xml:space="preserve">Expected May 2028</w:t>
+      </w:r>
+    </w:p>
+    <w:p>
+      <w:pPr>
+        <w:spacing w:after="15" w:before="0" w:line="245"/>
+        <w:jc w:val="left"/>
+      </w:pPr>
+      <w:r>
+        <w:rPr>
+          <w:rFonts w:ascii="Calibri" w:cs="Calibri" w:eastAsia="Calibri" w:hAnsi="Calibri"/>
+          <w:sz w:val="20"/>
+          <w:szCs w:val="20"/>
+        </w:rPr>
+        <w:t xml:space="preserve">B.E. Computer Science and Engineering  |  CGPA: 7.68 / 10</w:t>
+      </w:r>
+    </w:p>
+    <w:p>
+      <w:pPr>
+        <w:spacing w:after="15" w:before="0" w:line="245"/>
+        <w:jc w:val="left"/>
+      </w:pPr>
+      <w:r>
+        <w:rPr>
+          <w:rFonts w:ascii="Calibri" w:cs="Calibri" w:eastAsia="Calibri" w:hAnsi="Calibri"/>
+          <w:b/>
+          <w:bCs/>
+          <w:sz w:val="20"/>
+          <w:szCs w:val="20"/>
+        </w:rPr>
+        <w:t xml:space="preserve">Coursework: </w:t>
+      </w:r>
+      <w:r>
+        <w:rPr>
+          <w:rFonts w:ascii="Calibri" w:cs="Calibri" w:eastAsia="Calibri" w:hAnsi="Calibri"/>
+          <w:sz w:val="20"/>
+          <w:szCs w:val="20"/>
+        </w:rPr>
+        <w:t xml:space="preserve">Data Structures &amp; Algorithms (C++), OOP (Java), DBMS, Operating Systems, Distributed Systems, Web Development (MERN).</w:t>
+      </w:r>
+    </w:p>
+    <w:p>
+      <w:pPr>
+        <w:spacing w:after="0" w:before="0" w:line="245"/>
+        <w:jc w:val="left"/>
+      </w:pPr>
+      <w:r>
+        <w:rPr>
+          <w:rFonts w:ascii="Calibri" w:cs="Calibri" w:eastAsia="Calibri" w:hAnsi="Calibri"/>
+          <w:b/>
+          <w:bCs/>
+          <w:sz w:val="20"/>
+          <w:szCs w:val="20"/>
+        </w:rPr>
+        <w:t xml:space="preserve">School: </w:t>
+      </w:r>
+      <w:r>
+        <w:rPr>
+          <w:rFonts w:ascii="Calibri" w:cs="Calibri" w:eastAsia="Calibri" w:hAnsi="Calibri"/>
+          <w:sz w:val="20"/>
+          <w:szCs w:val="20"/>
+        </w:rPr>
+        <w:t xml:space="preserve">HSC 86.16% (Velammal Matriculation HSS, 2024).  SSLC 84.80% (Leo Matriculation HSS, 2022).</w:t>
+      </w:r>
+    </w:p>
+    <w:p>
+      <w:pPr>
+        <w:keepNext/>
+        <w:pBdr>
+          <w:bottom w:val="single" w:color="000000" w:sz="6" w:space="1"/>
+        </w:pBdr>
+        <w:spacing w:after="50" w:before="140"/>
+      </w:pPr>
+      <w:r>
+        <w:rPr>
+          <w:rFonts w:ascii="Calibri" w:cs="Calibri" w:eastAsia="Calibri" w:hAnsi="Calibri"/>
+          <w:b/>
+          <w:bCs/>
+          <w:color w:val="000000"/>
+          <w:sz w:val="22"/>
+          <w:szCs w:val="22"/>
+        </w:rPr>
+        <w:t xml:space="preserve">TECHNICAL SKILLS</w:t>
+      </w:r>
+    </w:p>
+    <w:p>
+      <w:pPr>
+        <w:spacing w:after="15" w:before="0" w:line="245"/>
+        <w:jc w:val="left"/>
+      </w:pPr>
+      <w:r>
+        <w:rPr>
+          <w:rFonts w:ascii="Calibri" w:cs="Calibri" w:eastAsia="Calibri" w:hAnsi="Calibri"/>
+          <w:b/>
+          <w:bCs/>
+          <w:sz w:val="20"/>
+          <w:szCs w:val="20"/>
+        </w:rPr>
+        <w:t xml:space="preserve">Languages: </w:t>
+      </w:r>
+      <w:r>
+        <w:rPr>
+          <w:rFonts w:ascii="Calibri" w:cs="Calibri" w:eastAsia="Calibri" w:hAnsi="Calibri"/>
+          <w:sz w:val="20"/>
+          <w:szCs w:val="20"/>
+        </w:rPr>
+        <w:t xml:space="preserve">Java, C++, Python, JavaScript (ES6+), TypeScript, SQL, Embedded C/C++</w:t>
+      </w:r>
+    </w:p>
+    <w:p>
+      <w:pPr>
+        <w:spacing w:after="15" w:before="0" w:line="245"/>
+        <w:jc w:val="left"/>
+      </w:pPr>
+      <w:r>
+        <w:rPr>
+          <w:rFonts w:ascii="Calibri" w:cs="Calibri" w:eastAsia="Calibri" w:hAnsi="Calibri"/>
+          <w:b/>
+          <w:bCs/>
+          <w:sz w:val="20"/>
+          <w:szCs w:val="20"/>
+        </w:rPr>
+        <w:t xml:space="preserve">Cloud &amp; DevOps: </w:t>
+      </w:r>
+      <w:r>
+        <w:rPr>
+          <w:rFonts w:ascii="Calibri" w:cs="Calibri" w:eastAsia="Calibri" w:hAnsi="Calibri"/>
+          <w:sz w:val="20"/>
+          <w:szCs w:val="20"/>
+        </w:rPr>
+        <w:t xml:space="preserve">Microsoft Azure (AZ-900), Azure Resource Manager APIs, Entra ID / RBAC, Docker, CI/CD, REST APIs</w:t>
+      </w:r>
+    </w:p>
+    <w:p>
+      <w:pPr>
+        <w:spacing w:after="15" w:before="0" w:line="245"/>
+        <w:jc w:val="left"/>
+      </w:pPr>
+      <w:r>
+        <w:rPr>
+          <w:rFonts w:ascii="Calibri" w:cs="Calibri" w:eastAsia="Calibri" w:hAnsi="Calibri"/>
+          <w:b/>
+          <w:bCs/>
+          <w:sz w:val="20"/>
+          <w:szCs w:val="20"/>
+        </w:rPr>
+        <w:t xml:space="preserve">Web &amp; Backend: </w:t>
+      </w:r>
+      <w:r>
+        <w:rPr>
+          <w:rFonts w:ascii="Calibri" w:cs="Calibri" w:eastAsia="Calibri" w:hAnsi="Calibri"/>
+          <w:sz w:val="20"/>
+          <w:szCs w:val="20"/>
+        </w:rPr>
+        <w:t xml:space="preserve">Next.js 14, React 18, Node.js, Express, Flask, FastAPI, SQLAlchemy, Tailwind CSS, Supabase</w:t>
+      </w:r>
+    </w:p>
+    <w:p>
+      <w:pPr>
+        <w:spacing w:after="15" w:before="0" w:line="245"/>
+        <w:jc w:val="left"/>
+      </w:pPr>
+      <w:r>
+        <w:rPr>
+          <w:rFonts w:ascii="Calibri" w:cs="Calibri" w:eastAsia="Calibri" w:hAnsi="Calibri"/>
+          <w:b/>
+          <w:bCs/>
+          <w:sz w:val="20"/>
+          <w:szCs w:val="20"/>
+        </w:rPr>
+        <w:t xml:space="preserve">AI &amp; Data: </w:t>
+      </w:r>
+      <w:r>
+        <w:rPr>
+          <w:rFonts w:ascii="Calibri" w:cs="Calibri" w:eastAsia="Calibri" w:hAnsi="Calibri"/>
+          <w:sz w:val="20"/>
+          <w:szCs w:val="20"/>
+        </w:rPr>
+        <w:t xml:space="preserve">TensorFlow.js, TensorFlow Lite, scikit-learn, LightGBM, SHAP, NetworkX, Groq (Llama-3.1)</w:t>
+      </w:r>
+    </w:p>
+    <w:p>
+      <w:pPr>
+        <w:spacing w:after="15" w:before="0" w:line="245"/>
+        <w:jc w:val="left"/>
+      </w:pPr>
+      <w:r>
+        <w:rPr>
+          <w:rFonts w:ascii="Calibri" w:cs="Calibri" w:eastAsia="Calibri" w:hAnsi="Calibri"/>
+          <w:b/>
+          <w:bCs/>
+          <w:sz w:val="20"/>
+          <w:szCs w:val="20"/>
+        </w:rPr>
+        <w:t xml:space="preserve">Systems &amp; Tools: </w:t>
+      </w:r>
+      <w:r>
+        <w:rPr>
+          <w:rFonts w:ascii="Calibri" w:cs="Calibri" w:eastAsia="Calibri" w:hAnsi="Calibri"/>
+          <w:sz w:val="20"/>
+          <w:szCs w:val="20"/>
+        </w:rPr>
+        <w:t xml:space="preserve">WebSockets, MQTT, ESP32, Arduino, IndexedDB, Twilio Voice, Git, GitHub, Postman, Linux CLI</w:t>
+      </w:r>
+    </w:p>
+    <w:p>
+      <w:pPr>
+        <w:keepNext/>
+        <w:pBdr>
+          <w:bottom w:val="single" w:color="000000" w:sz="6" w:space="1"/>
+        </w:pBdr>
+        <w:spacing w:after="50" w:before="140"/>
+      </w:pPr>
+      <w:r>
+        <w:rPr>
+          <w:rFonts w:ascii="Calibri" w:cs="Calibri" w:eastAsia="Calibri" w:hAnsi="Calibri"/>
+          <w:b/>
+          <w:bCs/>
+          <w:color w:val="000000"/>
+          <w:sz w:val="22"/>
+          <w:szCs w:val="22"/>
+        </w:rPr>
+        <w:t xml:space="preserve">SELECTED ENGINEERING PROJECTS</w:t>
+      </w:r>
+    </w:p>
+    <w:p>
+      <w:pPr>
+        <w:keepNext/>
+        <w:tabs>
+          <w:tab w:val="right" w:pos="10178"/>
+        </w:tabs>
+        <w:spacing w:after="10" w:before="20" w:line="250"/>
+        <w:jc w:val="left"/>
+      </w:pPr>
+      <w:r>
+        <w:rPr>
+          <w:rFonts w:ascii="Calibri" w:cs="Calibri" w:eastAsia="Calibri" w:hAnsi="Calibri"/>
+          <w:b/>
+          <w:bCs/>
+          <w:sz w:val="20"/>
+          <w:szCs w:val="20"/>
+        </w:rPr>
         <w:t xml:space="preserve">CloudPulse</w:t>
       </w:r>
       <w:r>
@@ -394,7 +486,7 @@
           <w:ilvl w:val="0"/>
           <w:numId w:val="2"/>
         </w:numPr>
-        <w:spacing w:after="20" w:line="245"/>
+        <w:spacing w:after="25" w:line="245"/>
         <w:jc w:val="left"/>
       </w:pPr>
       <w:r>
@@ -413,7 +505,7 @@
           <w:ilvl w:val="0"/>
           <w:numId w:val="2"/>
         </w:numPr>
-        <w:spacing w:after="20" w:line="245"/>
+        <w:spacing w:after="25" w:line="245"/>
         <w:jc w:val="left"/>
       </w:pPr>
       <w:r>
@@ -479,7 +571,7 @@
           <w:ilvl w:val="0"/>
           <w:numId w:val="2"/>
         </w:numPr>
-        <w:spacing w:after="20" w:line="245"/>
+        <w:spacing w:after="25" w:line="245"/>
         <w:jc w:val="left"/>
       </w:pPr>
       <w:r>
@@ -498,7 +590,7 @@
           <w:ilvl w:val="0"/>
           <w:numId w:val="2"/>
         </w:numPr>
-        <w:spacing w:after="20" w:line="245"/>
+        <w:spacing w:after="25" w:line="245"/>
         <w:jc w:val="left"/>
       </w:pPr>
       <w:r>
@@ -564,7 +656,7 @@
           <w:ilvl w:val="0"/>
           <w:numId w:val="2"/>
         </w:numPr>
-        <w:spacing w:after="20" w:line="245"/>
+        <w:spacing w:after="25" w:line="245"/>
         <w:jc w:val="left"/>
       </w:pPr>
       <w:r>
@@ -583,7 +675,7 @@
           <w:ilvl w:val="0"/>
           <w:numId w:val="2"/>
         </w:numPr>
-        <w:spacing w:after="20" w:line="245"/>
+        <w:spacing w:after="25" w:line="245"/>
         <w:jc w:val="left"/>
       </w:pPr>
       <w:r>
@@ -649,7 +741,7 @@
           <w:ilvl w:val="0"/>
           <w:numId w:val="2"/>
         </w:numPr>
-        <w:spacing w:after="20" w:line="245"/>
+        <w:spacing w:after="25" w:line="245"/>
         <w:jc w:val="left"/>
       </w:pPr>
       <w:r>
@@ -713,7 +805,7 @@
           <w:ilvl w:val="0"/>
           <w:numId w:val="2"/>
         </w:numPr>
-        <w:spacing w:after="20" w:line="245"/>
+        <w:spacing w:after="25" w:line="245"/>
         <w:jc w:val="left"/>
       </w:pPr>
       <w:r>
@@ -731,7 +823,7 @@
         <w:pBdr>
           <w:bottom w:val="single" w:color="000000" w:sz="6" w:space="1"/>
         </w:pBdr>
-        <w:spacing w:after="40" w:before="100"/>
+        <w:spacing w:after="50" w:before="140"/>
       </w:pPr>
       <w:r>
         <w:rPr>
@@ -797,7 +889,7 @@
           <w:ilvl w:val="0"/>
           <w:numId w:val="2"/>
         </w:numPr>
-        <w:spacing w:after="20" w:line="245"/>
+        <w:spacing w:after="25" w:line="245"/>
         <w:jc w:val="left"/>
       </w:pPr>
       <w:r>
@@ -816,7 +908,7 @@
           <w:ilvl w:val="0"/>
           <w:numId w:val="2"/>
         </w:numPr>
-        <w:spacing w:after="20" w:line="245"/>
+        <w:spacing w:after="25" w:line="245"/>
         <w:jc w:val="left"/>
       </w:pPr>
       <w:r>
@@ -834,7 +926,7 @@
         <w:pBdr>
           <w:bottom w:val="single" w:color="000000" w:sz="6" w:space="1"/>
         </w:pBdr>
-        <w:spacing w:after="40" w:before="100"/>
+        <w:spacing w:after="50" w:before="140"/>
       </w:pPr>
       <w:r>
         <w:rPr>
@@ -855,7 +947,7 @@
           <w:ilvl w:val="0"/>
           <w:numId w:val="2"/>
         </w:numPr>
-        <w:spacing w:after="20" w:line="245"/>
+        <w:spacing w:after="25" w:line="245"/>
         <w:jc w:val="left"/>
       </w:pPr>
       <w:r>
@@ -902,7 +994,7 @@
           <w:ilvl w:val="0"/>
           <w:numId w:val="2"/>
         </w:numPr>
-        <w:spacing w:after="20" w:line="245"/>
+        <w:spacing w:after="25" w:line="245"/>
         <w:jc w:val="left"/>
       </w:pPr>
       <w:r>
@@ -948,7 +1040,7 @@
         <w:pBdr>
           <w:bottom w:val="single" w:color="000000" w:sz="6" w:space="1"/>
         </w:pBdr>
-        <w:spacing w:after="40" w:before="100"/>
+        <w:spacing w:after="50" w:before="140"/>
       </w:pPr>
       <w:r>
         <w:rPr>
@@ -959,138 +1051,65 @@
           <w:sz w:val="22"/>
           <w:szCs w:val="22"/>
         </w:rPr>
-        <w:t xml:space="preserve">EDUCATION &amp; CERTIFICATIONS</w:t>
-      </w:r>
-    </w:p>
-    <w:p>
-      <w:pPr>
-        <w:keepNext/>
-        <w:tabs>
-          <w:tab w:val="right" w:pos="10178"/>
-        </w:tabs>
-        <w:spacing w:after="10" w:before="20" w:line="250"/>
-        <w:jc w:val="left"/>
-      </w:pPr>
-      <w:r>
-        <w:rPr>
-          <w:rFonts w:ascii="Calibri" w:cs="Calibri" w:eastAsia="Calibri" w:hAnsi="Calibri"/>
-          <w:b/>
-          <w:bCs/>
-          <w:sz w:val="20"/>
-          <w:szCs w:val="20"/>
-        </w:rPr>
-        <w:t xml:space="preserve">R.M.K. College of Engineering and Technology</w:t>
-      </w:r>
-      <w:r>
-        <w:rPr>
-          <w:rFonts w:ascii="Calibri" w:cs="Calibri" w:eastAsia="Calibri" w:hAnsi="Calibri"/>
-          <w:sz w:val="20"/>
-          <w:szCs w:val="20"/>
-        </w:rPr>
-        <w:t xml:space="preserve">, Chennai</w:t>
-      </w:r>
-      <w:r>
-        <w:rPr>
-          <w:rFonts w:ascii="Calibri" w:cs="Calibri" w:eastAsia="Calibri" w:hAnsi="Calibri"/>
-          <w:sz w:val="20"/>
-          <w:szCs w:val="20"/>
-        </w:rPr>
-        <w:t xml:space="preserve">	</w:t>
-      </w:r>
-      <w:r>
-        <w:rPr>
-          <w:rFonts w:ascii="Calibri" w:cs="Calibri" w:eastAsia="Calibri" w:hAnsi="Calibri"/>
-          <w:color w:val="000000"/>
-          <w:sz w:val="20"/>
-          <w:szCs w:val="20"/>
-        </w:rPr>
-        <w:t xml:space="preserve">Expected May 2028</w:t>
-      </w:r>
-    </w:p>
-    <w:p>
-      <w:pPr>
-        <w:spacing w:after="15" w:before="0" w:line="245"/>
-        <w:jc w:val="left"/>
-      </w:pPr>
-      <w:r>
-        <w:rPr>
-          <w:rFonts w:ascii="Calibri" w:cs="Calibri" w:eastAsia="Calibri" w:hAnsi="Calibri"/>
-          <w:sz w:val="20"/>
-          <w:szCs w:val="20"/>
-        </w:rPr>
-        <w:t xml:space="preserve">B.E. Computer Science and Engineering  |  CGPA: 7.68 / 10</w:t>
-      </w:r>
-    </w:p>
-    <w:p>
-      <w:pPr>
-        <w:spacing w:after="15" w:before="0" w:line="245"/>
-        <w:jc w:val="left"/>
-      </w:pPr>
-      <w:r>
-        <w:rPr>
-          <w:rFonts w:ascii="Calibri" w:cs="Calibri" w:eastAsia="Calibri" w:hAnsi="Calibri"/>
-          <w:b/>
-          <w:bCs/>
-          <w:sz w:val="20"/>
-          <w:szCs w:val="20"/>
-        </w:rPr>
-        <w:t xml:space="preserve">Coursework: </w:t>
-      </w:r>
-      <w:r>
-        <w:rPr>
-          <w:rFonts w:ascii="Calibri" w:cs="Calibri" w:eastAsia="Calibri" w:hAnsi="Calibri"/>
-          <w:sz w:val="20"/>
-          <w:szCs w:val="20"/>
-        </w:rPr>
-        <w:t xml:space="preserve">Data Structures &amp; Algorithms (C++), OOP (Java), DBMS, Operating Systems, Distributed Systems, Web Development (MERN).</w:t>
-      </w:r>
-    </w:p>
-    <w:p>
-      <w:pPr>
-        <w:spacing w:after="15" w:before="0" w:line="245"/>
-        <w:jc w:val="left"/>
-      </w:pPr>
-      <w:r>
-        <w:rPr>
-          <w:rFonts w:ascii="Calibri" w:cs="Calibri" w:eastAsia="Calibri" w:hAnsi="Calibri"/>
-          <w:b/>
-          <w:bCs/>
-          <w:sz w:val="20"/>
-          <w:szCs w:val="20"/>
-        </w:rPr>
-        <w:t xml:space="preserve">Certifications: </w:t>
-      </w:r>
-      <w:r>
-        <w:rPr>
-          <w:rFonts w:ascii="Calibri" w:cs="Calibri" w:eastAsia="Calibri" w:hAnsi="Calibri"/>
-          <w:sz w:val="20"/>
-          <w:szCs w:val="20"/>
-        </w:rPr>
-        <w:t xml:space="preserve">Microsoft Azure Fundamentals (AZ-900), Jul 2026, Credential ID 2A513E569A92A1A0.  JPMorgan Chase &amp; Co. Software Engineering Job Simulation (Forage), Jan–Feb 2026.</w:t>
-      </w:r>
-    </w:p>
-    <w:p>
-      <w:pPr>
-        <w:spacing w:after="0" w:before="0" w:line="245"/>
-        <w:jc w:val="left"/>
-      </w:pPr>
-      <w:r>
-        <w:rPr>
-          <w:rFonts w:ascii="Calibri" w:cs="Calibri" w:eastAsia="Calibri" w:hAnsi="Calibri"/>
-          <w:b/>
-          <w:bCs/>
-          <w:sz w:val="20"/>
-          <w:szCs w:val="20"/>
-        </w:rPr>
-        <w:t xml:space="preserve">School: </w:t>
-      </w:r>
-      <w:r>
-        <w:rPr>
-          <w:rFonts w:ascii="Calibri" w:cs="Calibri" w:eastAsia="Calibri" w:hAnsi="Calibri"/>
-          <w:sz w:val="20"/>
-          <w:szCs w:val="20"/>
-        </w:rPr>
-        <w:t xml:space="preserve">HSC 86.16% (Velammal Matriculation HSS, 2024).  SSLC 84.80% (Leo Matriculation HSS, 2022).</w:t>
+        <w:t xml:space="preserve">CERTIFICATIONS</w:t>
+      </w:r>
+    </w:p>
+    <w:p>
+      <w:pPr>
+        <w:pStyle w:val="ListParagraph"/>
+        <w:numPr>
+          <w:ilvl w:val="0"/>
+          <w:numId w:val="2"/>
+        </w:numPr>
+        <w:spacing w:after="25" w:line="245"/>
+        <w:jc w:val="left"/>
+      </w:pPr>
+      <w:r>
+        <w:rPr>
+          <w:rFonts w:ascii="Calibri" w:cs="Calibri" w:eastAsia="Calibri" w:hAnsi="Calibri"/>
+          <w:b/>
+          <w:bCs/>
+          <w:sz w:val="20"/>
+          <w:szCs w:val="20"/>
+        </w:rPr>
+        <w:t xml:space="preserve">Microsoft Certified: Azure Fundamentals (AZ-900)</w:t>
+      </w:r>
+      <w:r>
+        <w:rPr>
+          <w:rFonts w:ascii="Calibri" w:cs="Calibri" w:eastAsia="Calibri" w:hAnsi="Calibri"/>
+          <w:sz w:val="20"/>
+          <w:szCs w:val="20"/>
+        </w:rPr>
+        <w:t xml:space="preserve">, July 2026. Credential ID 2A513E569A92A1A0.</w:t>
+      </w:r>
+    </w:p>
+    <w:p>
+      <w:pPr>
+        <w:pStyle w:val="ListParagraph"/>
+        <w:numPr>
+          <w:ilvl w:val="0"/>
+          <w:numId w:val="2"/>
+        </w:numPr>
+        <w:spacing w:after="25" w:line="245"/>
+        <w:jc w:val="left"/>
+      </w:pPr>
+      <w:r>
+        <w:rPr>
+          <w:rFonts w:ascii="Calibri" w:cs="Calibri" w:eastAsia="Calibri" w:hAnsi="Calibri"/>
+          <w:b/>
+          <w:bCs/>
+          <w:sz w:val="20"/>
+          <w:szCs w:val="20"/>
+        </w:rPr>
+        <w:t xml:space="preserve">JPMorgan Chase &amp; Co. Software Engineering Job Simulation</w:t>
+      </w:r>
+      <w:r>
+        <w:rPr>
+          <w:rFonts w:ascii="Calibri" w:cs="Calibri" w:eastAsia="Calibri" w:hAnsi="Calibri"/>
+          <w:sz w:val="20"/>
+          <w:szCs w:val="20"/>
+        </w:rPr>
+        <w:t xml:space="preserve"> (Forage), Jan–Feb 2026: Kafka integration, H2 in-memory DB, REST APIs.</w:t>
       </w:r>
     </w:p>
     <w:sectPr>

</xml_diff>